<commit_message>
Tach kich ban thuyet trinh thanh hai ban rieng
KICH_BAN_THUYET_TRINH (7 trang) - ban cho ngay demo that tren ba may.
Go muc tap duot ra, chi de mot dong tro sang file moi.

KICH_BAN_TAP_1MAY (9 trang) - ban moi, danh rieng cho tu dien thu tren
mot may. Chi tiet 8 buoc, moi buoc ghi ro con so phai thay, lay tu lan
chay that: DCA001, 800->750, 150->200, loi "KHONG DU HANG: kho KHO_A
chi con 370", tong VT009 = 1370. Kem bang ba diem khac voi demo that
va bang xu ly su co.

Co-Authored-By: Claude Opus 5 <noreply@anthropic.com>
</commit_message>
<xml_diff>
--- a/Do an cuoi ki/KICH_BAN_THUYET_TRINH.docx
+++ b/Do an cuoi ki/KICH_BAN_THUYET_TRINH.docx
@@ -63,18 +63,6 @@
       <w:r>
         <w:rPr>
           <w:rFonts w:ascii="Times New Roman" w:cs="Times New Roman" w:eastAsia="Times New Roman" w:hAnsi="Times New Roman"/>
-          <w:b w:val="false"/>
-          <w:bCs w:val="false"/>
-          <w:i/>
-          <w:iCs/>
-          <w:sz w:val="24"/>
-          <w:szCs w:val="24"/>
-        </w:rPr>
-        <w:t xml:space="preserve">Cầm tờ này khi demo. Mỗi mục có </w:t>
-      </w:r>
-      <w:r>
-        <w:rPr>
-          <w:rFonts w:ascii="Times New Roman" w:cs="Times New Roman" w:eastAsia="Times New Roman" w:hAnsi="Times New Roman"/>
           <w:b/>
           <w:bCs/>
           <w:i/>
@@ -82,7 +70,7 @@
           <w:sz w:val="24"/>
           <w:szCs w:val="24"/>
         </w:rPr>
-        <w:t xml:space="preserve">lệnh chạy</w:t>
+        <w:t xml:space="preserve">Bản cho ngày demo thật — ba máy vật lý.</w:t>
       </w:r>
       <w:r>
         <w:rPr>
@@ -94,7 +82,7 @@
           <w:sz w:val="24"/>
           <w:szCs w:val="24"/>
         </w:rPr>
-        <w:t xml:space="preserve"> và </w:t>
+        <w:t xml:space="preserve"> Cầm tờ này khi demo. Mỗi mục có </w:t>
       </w:r>
       <w:r>
         <w:rPr>
@@ -106,6 +94,30 @@
           <w:sz w:val="24"/>
           <w:szCs w:val="24"/>
         </w:rPr>
+        <w:t xml:space="preserve">lệnh chạy</w:t>
+      </w:r>
+      <w:r>
+        <w:rPr>
+          <w:rFonts w:ascii="Times New Roman" w:cs="Times New Roman" w:eastAsia="Times New Roman" w:hAnsi="Times New Roman"/>
+          <w:b w:val="false"/>
+          <w:bCs w:val="false"/>
+          <w:i/>
+          <w:iCs/>
+          <w:sz w:val="24"/>
+          <w:szCs w:val="24"/>
+        </w:rPr>
+        <w:t xml:space="preserve"> và </w:t>
+      </w:r>
+      <w:r>
+        <w:rPr>
+          <w:rFonts w:ascii="Times New Roman" w:cs="Times New Roman" w:eastAsia="Times New Roman" w:hAnsi="Times New Roman"/>
+          <w:b/>
+          <w:bCs/>
+          <w:i/>
+          <w:iCs/>
+          <w:sz w:val="24"/>
+          <w:szCs w:val="24"/>
+        </w:rPr>
         <w:t xml:space="preserve">lời nói</w:t>
       </w:r>
       <w:r>
@@ -643,709 +655,70 @@
     </w:p>
     <w:p>
       <w:pPr>
-        <w:pStyle w:val="Heading1"/>
-        <w:spacing w:after="120" w:before="240"/>
+        <w:pBdr>
+          <w:left w:val="single" w:color="F0A500" w:sz="12" w:space="8"/>
+        </w:pBdr>
+        <w:spacing w:after="100" w:line="300"/>
+        <w:ind w:left="360"/>
+        <w:jc w:val="both"/>
       </w:pPr>
       <w:r>
         <w:rPr>
           <w:rFonts w:ascii="Times New Roman" w:cs="Times New Roman" w:eastAsia="Times New Roman" w:hAnsi="Times New Roman"/>
           <w:b/>
           <w:bCs/>
-          <w:i w:val="false"/>
-          <w:iCs w:val="false"/>
-          <w:color w:val="1F3864"/>
-          <w:sz w:val="32"/>
-          <w:szCs w:val="32"/>
-        </w:rPr>
-        <w:t xml:space="preserve">TẬP DƯỢT MỘT MÌNH — khi bạn bè không có mặt</w:t>
-      </w:r>
-    </w:p>
-    <w:p>
-      <w:pPr>
-        <w:spacing w:after="60"/>
-      </w:pPr>
-      <w:r>
-        <w:t xml:space="preserve"/>
-      </w:r>
-    </w:p>
-    <w:p>
-      <w:pPr>
-        <w:spacing w:after="80" w:line="300"/>
-        <w:jc w:val="both"/>
-      </w:pPr>
-      <w:r>
-        <w:rPr>
-          <w:rFonts w:ascii="Times New Roman" w:cs="Times New Roman" w:eastAsia="Times New Roman" w:hAnsi="Times New Roman"/>
-          <w:b w:val="false"/>
-          <w:bCs w:val="false"/>
-          <w:i w:val="false"/>
-          <w:iCs w:val="false"/>
-          <w:sz w:val="24"/>
-          <w:szCs w:val="24"/>
-        </w:rPr>
-        <w:t xml:space="preserve">Ba thể hiện </w:t>
+          <w:i/>
+          <w:iCs/>
+          <w:sz w:val="24"/>
+          <w:szCs w:val="24"/>
+        </w:rPr>
+        <w:t xml:space="preserve">Chưa tập lần nào?</w:t>
+      </w:r>
+      <w:r>
+        <w:rPr>
+          <w:rFonts w:ascii="Times New Roman" w:cs="Times New Roman" w:eastAsia="Times New Roman" w:hAnsi="Times New Roman"/>
+          <w:b w:val="false"/>
+          <w:bCs w:val="false"/>
+          <w:i/>
+          <w:iCs/>
+          <w:sz w:val="24"/>
+          <w:szCs w:val="24"/>
+        </w:rPr>
+        <w:t xml:space="preserve"> Đừng lấy file này ra tập. Mở </w:t>
       </w:r>
       <w:r>
         <w:rPr>
           <w:rFonts w:ascii="Consolas" w:cs="Consolas" w:eastAsia="Consolas" w:hAnsi="Consolas"/>
           <w:b w:val="false"/>
           <w:bCs w:val="false"/>
-          <w:i w:val="false"/>
-          <w:iCs w:val="false"/>
+          <w:i/>
+          <w:iCs/>
           <w:color w:val="0B5394"/>
           <w:sz w:val="20"/>
           <w:szCs w:val="20"/>
           <w:shd w:fill="F0F0F0" w:val="clear"/>
         </w:rPr>
-        <w:t xml:space="preserve">KHO_A</w:t>
-      </w:r>
-      <w:r>
-        <w:rPr>
-          <w:rFonts w:ascii="Times New Roman" w:cs="Times New Roman" w:eastAsia="Times New Roman" w:hAnsi="Times New Roman"/>
-          <w:b w:val="false"/>
-          <w:bCs w:val="false"/>
-          <w:i w:val="false"/>
-          <w:iCs w:val="false"/>
-          <w:sz w:val="24"/>
-          <w:szCs w:val="24"/>
-        </w:rPr>
-        <w:t xml:space="preserve">, </w:t>
-      </w:r>
-      <w:r>
-        <w:rPr>
-          <w:rFonts w:ascii="Consolas" w:cs="Consolas" w:eastAsia="Consolas" w:hAnsi="Consolas"/>
-          <w:b w:val="false"/>
-          <w:bCs w:val="false"/>
-          <w:i w:val="false"/>
-          <w:iCs w:val="false"/>
-          <w:color w:val="0B5394"/>
-          <w:sz w:val="20"/>
-          <w:szCs w:val="20"/>
-          <w:shd w:fill="F0F0F0" w:val="clear"/>
-        </w:rPr>
-        <w:t xml:space="preserve">KHO_B</w:t>
-      </w:r>
-      <w:r>
-        <w:rPr>
-          <w:rFonts w:ascii="Times New Roman" w:cs="Times New Roman" w:eastAsia="Times New Roman" w:hAnsi="Times New Roman"/>
-          <w:b w:val="false"/>
-          <w:bCs w:val="false"/>
-          <w:i w:val="false"/>
-          <w:iCs w:val="false"/>
-          <w:sz w:val="24"/>
-          <w:szCs w:val="24"/>
-        </w:rPr>
-        <w:t xml:space="preserve">, </w:t>
-      </w:r>
-      <w:r>
-        <w:rPr>
-          <w:rFonts w:ascii="Consolas" w:cs="Consolas" w:eastAsia="Consolas" w:hAnsi="Consolas"/>
-          <w:b w:val="false"/>
-          <w:bCs w:val="false"/>
-          <w:i w:val="false"/>
-          <w:iCs w:val="false"/>
-          <w:color w:val="0B5394"/>
-          <w:sz w:val="20"/>
-          <w:szCs w:val="20"/>
-          <w:shd w:fill="F0F0F0" w:val="clear"/>
-        </w:rPr>
-        <w:t xml:space="preserve">KHO_C</w:t>
-      </w:r>
-      <w:r>
-        <w:rPr>
-          <w:rFonts w:ascii="Times New Roman" w:cs="Times New Roman" w:eastAsia="Times New Roman" w:hAnsi="Times New Roman"/>
-          <w:b w:val="false"/>
-          <w:bCs w:val="false"/>
-          <w:i w:val="false"/>
-          <w:iCs w:val="false"/>
-          <w:sz w:val="24"/>
-          <w:szCs w:val="24"/>
-        </w:rPr>
-        <w:t xml:space="preserve"> vẫn còn nguyên trên máy bạn, nên tập được đủ mọi màn mà không cần ai bật máy.</w:t>
-      </w:r>
-    </w:p>
-    <w:p>
-      <w:pPr>
-        <w:spacing w:after="60"/>
-      </w:pPr>
-      <w:r>
-        <w:t xml:space="preserve"/>
-      </w:r>
-    </w:p>
-    <w:p>
-      <w:pPr>
-        <w:spacing w:after="80" w:line="300"/>
-        <w:jc w:val="both"/>
-      </w:pPr>
-      <w:r>
-        <w:rPr>
-          <w:rFonts w:ascii="Times New Roman" w:cs="Times New Roman" w:eastAsia="Times New Roman" w:hAnsi="Times New Roman"/>
-          <w:b/>
-          <w:bCs/>
-          <w:i w:val="false"/>
-          <w:iCs w:val="false"/>
-          <w:sz w:val="24"/>
-          <w:szCs w:val="24"/>
-        </w:rPr>
-        <w:t xml:space="preserve">Chuyển sang chế độ một máy:</w:t>
-      </w:r>
-      <w:r>
-        <w:rPr>
-          <w:rFonts w:ascii="Times New Roman" w:cs="Times New Roman" w:eastAsia="Times New Roman" w:hAnsi="Times New Roman"/>
-          <w:b w:val="false"/>
-          <w:bCs w:val="false"/>
-          <w:i w:val="false"/>
-          <w:iCs w:val="false"/>
-          <w:sz w:val="24"/>
-          <w:szCs w:val="24"/>
-        </w:rPr>
-        <w:t xml:space="preserve"> mở </w:t>
-      </w:r>
-      <w:r>
-        <w:rPr>
-          <w:rFonts w:ascii="Consolas" w:cs="Consolas" w:eastAsia="Consolas" w:hAnsi="Consolas"/>
-          <w:b w:val="false"/>
-          <w:bCs w:val="false"/>
-          <w:i w:val="false"/>
-          <w:iCs w:val="false"/>
-          <w:color w:val="0B5394"/>
-          <w:sz w:val="20"/>
-          <w:szCs w:val="20"/>
-          <w:shd w:fill="F0F0F0" w:val="clear"/>
-        </w:rPr>
-        <w:t xml:space="preserve">SQL\13_DoiCheDo_MotMay_BaMay.sql</w:t>
-      </w:r>
-      <w:r>
-        <w:rPr>
-          <w:rFonts w:ascii="Times New Roman" w:cs="Times New Roman" w:eastAsia="Times New Roman" w:hAnsi="Times New Roman"/>
-          <w:b w:val="false"/>
-          <w:bCs w:val="false"/>
-          <w:i w:val="false"/>
-          <w:iCs w:val="false"/>
-          <w:sz w:val="24"/>
-          <w:szCs w:val="24"/>
-        </w:rPr>
-        <w:t xml:space="preserve">, dòng </w:t>
-      </w:r>
-      <w:r>
-        <w:rPr>
-          <w:rFonts w:ascii="Consolas" w:cs="Consolas" w:eastAsia="Consolas" w:hAnsi="Consolas"/>
-          <w:b w:val="false"/>
-          <w:bCs w:val="false"/>
-          <w:i w:val="false"/>
-          <w:iCs w:val="false"/>
-          <w:color w:val="0B5394"/>
-          <w:sz w:val="20"/>
-          <w:szCs w:val="20"/>
-          <w:shd w:fill="F0F0F0" w:val="clear"/>
-        </w:rPr>
-        <w:t xml:space="preserve">@CheDo</w:t>
-      </w:r>
-      <w:r>
-        <w:rPr>
-          <w:rFonts w:ascii="Times New Roman" w:cs="Times New Roman" w:eastAsia="Times New Roman" w:hAnsi="Times New Roman"/>
-          <w:b w:val="false"/>
-          <w:bCs w:val="false"/>
-          <w:i w:val="false"/>
-          <w:iCs w:val="false"/>
-          <w:sz w:val="24"/>
-          <w:szCs w:val="24"/>
-        </w:rPr>
-        <w:t xml:space="preserve"> để </w:t>
-      </w:r>
-      <w:r>
-        <w:rPr>
-          <w:rFonts w:ascii="Consolas" w:cs="Consolas" w:eastAsia="Consolas" w:hAnsi="Consolas"/>
-          <w:b w:val="false"/>
-          <w:bCs w:val="false"/>
-          <w:i w:val="false"/>
-          <w:iCs w:val="false"/>
-          <w:color w:val="0B5394"/>
-          <w:sz w:val="20"/>
-          <w:szCs w:val="20"/>
-          <w:shd w:fill="F0F0F0" w:val="clear"/>
-        </w:rPr>
-        <w:t xml:space="preserve">'MOTMAY'</w:t>
-      </w:r>
-      <w:r>
-        <w:rPr>
-          <w:rFonts w:ascii="Times New Roman" w:cs="Times New Roman" w:eastAsia="Times New Roman" w:hAnsi="Times New Roman"/>
-          <w:b w:val="false"/>
-          <w:bCs w:val="false"/>
-          <w:i w:val="false"/>
-          <w:iCs w:val="false"/>
-          <w:sz w:val="24"/>
-          <w:szCs w:val="24"/>
-        </w:rPr>
-        <w:t xml:space="preserve">, bấm F5. Rồi chạy </w:t>
-      </w:r>
-      <w:r>
-        <w:rPr>
-          <w:rFonts w:ascii="Consolas" w:cs="Consolas" w:eastAsia="Consolas" w:hAnsi="Consolas"/>
-          <w:b w:val="false"/>
-          <w:bCs w:val="false"/>
-          <w:i w:val="false"/>
-          <w:iCs w:val="false"/>
-          <w:color w:val="0B5394"/>
-          <w:sz w:val="20"/>
-          <w:szCs w:val="20"/>
-          <w:shd w:fill="F0F0F0" w:val="clear"/>
-        </w:rPr>
-        <w:t xml:space="preserve">07b_ResetDeChupLaiAnh.sql</w:t>
-      </w:r>
-      <w:r>
-        <w:rPr>
-          <w:rFonts w:ascii="Times New Roman" w:cs="Times New Roman" w:eastAsia="Times New Roman" w:hAnsi="Times New Roman"/>
-          <w:b w:val="false"/>
-          <w:bCs w:val="false"/>
-          <w:i w:val="false"/>
-          <w:iCs w:val="false"/>
-          <w:sz w:val="24"/>
-          <w:szCs w:val="24"/>
-        </w:rPr>
-        <w:t xml:space="preserve">.</w:t>
-      </w:r>
-    </w:p>
-    <w:p>
-      <w:pPr>
-        <w:spacing w:after="60"/>
-      </w:pPr>
-      <w:r>
-        <w:t xml:space="preserve"/>
-      </w:r>
-    </w:p>
-    <w:p>
-      <w:pPr>
-        <w:spacing w:after="80" w:line="300"/>
-        <w:jc w:val="both"/>
-      </w:pPr>
-      <w:r>
-        <w:rPr>
-          <w:rFonts w:ascii="Times New Roman" w:cs="Times New Roman" w:eastAsia="Times New Roman" w:hAnsi="Times New Roman"/>
-          <w:b w:val="false"/>
-          <w:bCs w:val="false"/>
-          <w:i w:val="false"/>
-          <w:iCs w:val="false"/>
-          <w:sz w:val="24"/>
-          <w:szCs w:val="24"/>
-        </w:rPr>
-        <w:t xml:space="preserve">Xong là tập được </w:t>
-      </w:r>
-      <w:r>
-        <w:rPr>
-          <w:rFonts w:ascii="Times New Roman" w:cs="Times New Roman" w:eastAsia="Times New Roman" w:hAnsi="Times New Roman"/>
-          <w:b/>
-          <w:bCs/>
-          <w:i w:val="false"/>
-          <w:iCs w:val="false"/>
-          <w:sz w:val="24"/>
-          <w:szCs w:val="24"/>
-        </w:rPr>
-        <w:t xml:space="preserve">màn 2 đến màn 7</w:t>
-      </w:r>
-      <w:r>
-        <w:rPr>
-          <w:rFonts w:ascii="Times New Roman" w:cs="Times New Roman" w:eastAsia="Times New Roman" w:hAnsi="Times New Roman"/>
-          <w:b w:val="false"/>
-          <w:bCs w:val="false"/>
-          <w:i w:val="false"/>
-          <w:iCs w:val="false"/>
-          <w:sz w:val="24"/>
-          <w:szCs w:val="24"/>
-        </w:rPr>
-        <w:t xml:space="preserve"> y như thật: điều chuyển, thiếu hàng, lỗi giữa chừng, tổng kết, phần mềm web. Số liệu giống hệt.</w:t>
-      </w:r>
-    </w:p>
-    <w:p>
-      <w:pPr>
-        <w:spacing w:after="60"/>
-      </w:pPr>
-      <w:r>
-        <w:t xml:space="preserve"/>
-      </w:r>
-    </w:p>
-    <w:p>
-      <w:pPr>
-        <w:spacing w:after="80" w:line="300"/>
-        <w:jc w:val="both"/>
-      </w:pPr>
-      <w:r>
-        <w:rPr>
-          <w:rFonts w:ascii="Times New Roman" w:cs="Times New Roman" w:eastAsia="Times New Roman" w:hAnsi="Times New Roman"/>
-          <w:b/>
-          <w:bCs/>
-          <w:i w:val="false"/>
-          <w:iCs w:val="false"/>
-          <w:sz w:val="24"/>
-          <w:szCs w:val="24"/>
-        </w:rPr>
-        <w:t xml:space="preserve">Hôm demo thật:</w:t>
-      </w:r>
-      <w:r>
-        <w:rPr>
-          <w:rFonts w:ascii="Times New Roman" w:cs="Times New Roman" w:eastAsia="Times New Roman" w:hAnsi="Times New Roman"/>
-          <w:b w:val="false"/>
-          <w:bCs w:val="false"/>
-          <w:i w:val="false"/>
-          <w:iCs w:val="false"/>
-          <w:sz w:val="24"/>
-          <w:szCs w:val="24"/>
-        </w:rPr>
-        <w:t xml:space="preserve"> mở lại file 13, đổi </w:t>
-      </w:r>
-      <w:r>
-        <w:rPr>
-          <w:rFonts w:ascii="Consolas" w:cs="Consolas" w:eastAsia="Consolas" w:hAnsi="Consolas"/>
-          <w:b w:val="false"/>
-          <w:bCs w:val="false"/>
-          <w:i w:val="false"/>
-          <w:iCs w:val="false"/>
-          <w:color w:val="0B5394"/>
-          <w:sz w:val="20"/>
-          <w:szCs w:val="20"/>
-          <w:shd w:fill="F0F0F0" w:val="clear"/>
-        </w:rPr>
-        <w:t xml:space="preserve">@CheDo</w:t>
-      </w:r>
-      <w:r>
-        <w:rPr>
-          <w:rFonts w:ascii="Times New Roman" w:cs="Times New Roman" w:eastAsia="Times New Roman" w:hAnsi="Times New Roman"/>
-          <w:b w:val="false"/>
-          <w:bCs w:val="false"/>
-          <w:i w:val="false"/>
-          <w:iCs w:val="false"/>
-          <w:sz w:val="24"/>
-          <w:szCs w:val="24"/>
-        </w:rPr>
-        <w:t xml:space="preserve"> thành </w:t>
-      </w:r>
-      <w:r>
-        <w:rPr>
-          <w:rFonts w:ascii="Consolas" w:cs="Consolas" w:eastAsia="Consolas" w:hAnsi="Consolas"/>
-          <w:b w:val="false"/>
-          <w:bCs w:val="false"/>
-          <w:i w:val="false"/>
-          <w:iCs w:val="false"/>
-          <w:color w:val="0B5394"/>
-          <w:sz w:val="20"/>
-          <w:szCs w:val="20"/>
-          <w:shd w:fill="F0F0F0" w:val="clear"/>
-        </w:rPr>
-        <w:t xml:space="preserve">'BAMAY'</w:t>
-      </w:r>
-      <w:r>
-        <w:rPr>
-          <w:rFonts w:ascii="Times New Roman" w:cs="Times New Roman" w:eastAsia="Times New Roman" w:hAnsi="Times New Roman"/>
-          <w:b w:val="false"/>
-          <w:bCs w:val="false"/>
-          <w:i w:val="false"/>
-          <w:iCs w:val="false"/>
-          <w:sz w:val="24"/>
-          <w:szCs w:val="24"/>
-        </w:rPr>
-        <w:t xml:space="preserve">, bấm F5. Hoặc chạy file 11 như hướng dẫn. Hai cách tương đương.</w:t>
-      </w:r>
-    </w:p>
-    <w:p>
-      <w:pPr>
-        <w:spacing w:after="60"/>
-      </w:pPr>
-      <w:r>
-        <w:t xml:space="preserve"/>
-      </w:r>
-    </w:p>
-    <w:p>
-      <w:pPr>
-        <w:spacing w:after="80" w:line="300"/>
-        <w:jc w:val="both"/>
-      </w:pPr>
-      <w:r>
-        <w:rPr>
-          <w:rFonts w:ascii="Times New Roman" w:cs="Times New Roman" w:eastAsia="Times New Roman" w:hAnsi="Times New Roman"/>
-          <w:b w:val="false"/>
-          <w:bCs w:val="false"/>
-          <w:i w:val="false"/>
-          <w:iCs w:val="false"/>
-          <w:sz w:val="24"/>
-          <w:szCs w:val="24"/>
-        </w:rPr>
-        <w:t xml:space="preserve">Ba điều cần biết khi tập một mình:</w:t>
-      </w:r>
-    </w:p>
-    <w:p>
-      <w:pPr>
-        <w:spacing w:after="60"/>
-      </w:pPr>
-      <w:r>
-        <w:t xml:space="preserve"/>
-      </w:r>
-    </w:p>
-    <w:p>
-      <w:pPr>
-        <w:spacing w:after="50" w:line="300"/>
-        <w:ind w:left="431" w:hanging="288"/>
-      </w:pPr>
-      <w:r>
-        <w:rPr>
-          <w:rFonts w:ascii="Times New Roman" w:cs="Times New Roman" w:eastAsia="Times New Roman" w:hAnsi="Times New Roman"/>
-          <w:sz w:val="24"/>
-          <w:szCs w:val="24"/>
-        </w:rPr>
-        <w:t xml:space="preserve">•  </w:t>
-      </w:r>
-      <w:r>
-        <w:rPr>
-          <w:rFonts w:ascii="Times New Roman" w:cs="Times New Roman" w:eastAsia="Times New Roman" w:hAnsi="Times New Roman"/>
-          <w:b/>
-          <w:bCs/>
-          <w:i w:val="false"/>
-          <w:iCs w:val="false"/>
-          <w:sz w:val="24"/>
-          <w:szCs w:val="24"/>
-        </w:rPr>
-        <w:t xml:space="preserve">Màn 1 không tập được.</w:t>
-      </w:r>
-      <w:r>
-        <w:rPr>
-          <w:rFonts w:ascii="Times New Roman" w:cs="Times New Roman" w:eastAsia="Times New Roman" w:hAnsi="Times New Roman"/>
-          <w:b w:val="false"/>
-          <w:bCs w:val="false"/>
-          <w:i w:val="false"/>
-          <w:iCs w:val="false"/>
-          <w:sz w:val="24"/>
-          <w:szCs w:val="24"/>
-        </w:rPr>
-        <w:t xml:space="preserve"> Nó phải ra ba tên máy khác nhau, mà chế độ một máy</w:t>
-      </w:r>
-    </w:p>
-    <w:p>
-      <w:pPr>
-        <w:spacing w:after="80" w:line="300"/>
-        <w:jc w:val="both"/>
-      </w:pPr>
-      <w:r>
-        <w:rPr>
-          <w:rFonts w:ascii="Times New Roman" w:cs="Times New Roman" w:eastAsia="Times New Roman" w:hAnsi="Times New Roman"/>
-          <w:b w:val="false"/>
-          <w:bCs w:val="false"/>
-          <w:i w:val="false"/>
-          <w:iCs w:val="false"/>
-          <w:sz w:val="24"/>
-          <w:szCs w:val="24"/>
-        </w:rPr>
-        <w:t xml:space="preserve">thì cả ba đều là </w:t>
-      </w:r>
-      <w:r>
-        <w:rPr>
-          <w:rFonts w:ascii="Consolas" w:cs="Consolas" w:eastAsia="Consolas" w:hAnsi="Consolas"/>
-          <w:b w:val="false"/>
-          <w:bCs w:val="false"/>
-          <w:i w:val="false"/>
-          <w:iCs w:val="false"/>
-          <w:color w:val="0B5394"/>
-          <w:sz w:val="20"/>
-          <w:szCs w:val="20"/>
-          <w:shd w:fill="F0F0F0" w:val="clear"/>
-        </w:rPr>
-        <w:t xml:space="preserve">Mignon</w:t>
-      </w:r>
-      <w:r>
-        <w:rPr>
-          <w:rFonts w:ascii="Times New Roman" w:cs="Times New Roman" w:eastAsia="Times New Roman" w:hAnsi="Times New Roman"/>
-          <w:b w:val="false"/>
-          <w:bCs w:val="false"/>
-          <w:i w:val="false"/>
-          <w:iCs w:val="false"/>
-          <w:sz w:val="24"/>
-          <w:szCs w:val="24"/>
-        </w:rPr>
-        <w:t xml:space="preserve">. Bỏ qua màn này lúc tập.</w:t>
-      </w:r>
-    </w:p>
-    <w:p>
-      <w:pPr>
-        <w:spacing w:after="50" w:line="300"/>
-        <w:ind w:left="431" w:hanging="288"/>
-      </w:pPr>
-      <w:r>
-        <w:rPr>
-          <w:rFonts w:ascii="Times New Roman" w:cs="Times New Roman" w:eastAsia="Times New Roman" w:hAnsi="Times New Roman"/>
-          <w:sz w:val="24"/>
-          <w:szCs w:val="24"/>
-        </w:rPr>
-        <w:t xml:space="preserve">•  </w:t>
-      </w:r>
-      <w:r>
-        <w:rPr>
-          <w:rFonts w:ascii="Times New Roman" w:cs="Times New Roman" w:eastAsia="Times New Roman" w:hAnsi="Times New Roman"/>
-          <w:b/>
-          <w:bCs/>
-          <w:i w:val="false"/>
-          <w:iCs w:val="false"/>
-          <w:sz w:val="24"/>
-          <w:szCs w:val="24"/>
-        </w:rPr>
-        <w:t xml:space="preserve">MS DTC không cần bật.</w:t>
-      </w:r>
-      <w:r>
-        <w:rPr>
-          <w:rFonts w:ascii="Times New Roman" w:cs="Times New Roman" w:eastAsia="Times New Roman" w:hAnsi="Times New Roman"/>
-          <w:b w:val="false"/>
-          <w:bCs w:val="false"/>
-          <w:i w:val="false"/>
-          <w:iCs w:val="false"/>
-          <w:sz w:val="24"/>
-          <w:szCs w:val="24"/>
-        </w:rPr>
-        <w:t xml:space="preserve"> Ba thể hiện dùng chung một DTC nội bộ. Nên dù tập</w:t>
-      </w:r>
-    </w:p>
-    <w:p>
-      <w:pPr>
-        <w:spacing w:after="80" w:line="300"/>
-        <w:jc w:val="both"/>
-      </w:pPr>
-      <w:r>
-        <w:rPr>
-          <w:rFonts w:ascii="Times New Roman" w:cs="Times New Roman" w:eastAsia="Times New Roman" w:hAnsi="Times New Roman"/>
-          <w:b w:val="false"/>
-          <w:bCs w:val="false"/>
-          <w:i w:val="false"/>
-          <w:iCs w:val="false"/>
-          <w:sz w:val="24"/>
-          <w:szCs w:val="24"/>
-        </w:rPr>
-        <w:t xml:space="preserve">trơn tru, hôm demo vẫn </w:t>
-      </w:r>
-      <w:r>
-        <w:rPr>
-          <w:rFonts w:ascii="Times New Roman" w:cs="Times New Roman" w:eastAsia="Times New Roman" w:hAnsi="Times New Roman"/>
-          <w:b/>
-          <w:bCs/>
-          <w:i w:val="false"/>
-          <w:iCs w:val="false"/>
-          <w:sz w:val="24"/>
-          <w:szCs w:val="24"/>
-        </w:rPr>
-        <w:t xml:space="preserve">phải chạy `CHAY_BAT_MSDTC.bat` ở cả ba máy</w:t>
-      </w:r>
-      <w:r>
-        <w:rPr>
-          <w:rFonts w:ascii="Times New Roman" w:cs="Times New Roman" w:eastAsia="Times New Roman" w:hAnsi="Times New Roman"/>
-          <w:b w:val="false"/>
-          <w:bCs w:val="false"/>
-          <w:i w:val="false"/>
-          <w:iCs w:val="false"/>
-          <w:sz w:val="24"/>
-          <w:szCs w:val="24"/>
-        </w:rPr>
-        <w:t xml:space="preserve">.</w:t>
-      </w:r>
-    </w:p>
-    <w:p>
-      <w:pPr>
-        <w:spacing w:after="50" w:line="300"/>
-        <w:ind w:left="431" w:hanging="288"/>
-      </w:pPr>
-      <w:r>
-        <w:rPr>
-          <w:rFonts w:ascii="Times New Roman" w:cs="Times New Roman" w:eastAsia="Times New Roman" w:hAnsi="Times New Roman"/>
-          <w:sz w:val="24"/>
-          <w:szCs w:val="24"/>
-        </w:rPr>
-        <w:t xml:space="preserve">•  </w:t>
-      </w:r>
-      <w:r>
-        <w:rPr>
-          <w:rFonts w:ascii="Times New Roman" w:cs="Times New Roman" w:eastAsia="Times New Roman" w:hAnsi="Times New Roman"/>
-          <w:b/>
-          <w:bCs/>
-          <w:i w:val="false"/>
-          <w:iCs w:val="false"/>
-          <w:sz w:val="24"/>
-          <w:szCs w:val="24"/>
-        </w:rPr>
-        <w:t xml:space="preserve">Đồng bộ danh mục sẽ không chạy.</w:t>
-      </w:r>
-      <w:r>
-        <w:rPr>
-          <w:rFonts w:ascii="Times New Roman" w:cs="Times New Roman" w:eastAsia="Times New Roman" w:hAnsi="Times New Roman"/>
-          <w:b w:val="false"/>
-          <w:bCs w:val="false"/>
-          <w:i w:val="false"/>
-          <w:iCs w:val="false"/>
-          <w:sz w:val="24"/>
-          <w:szCs w:val="24"/>
-        </w:rPr>
-        <w:t xml:space="preserve"> Replication vẫn đang trỏ sang hai máy bạn</w:t>
-      </w:r>
-    </w:p>
-    <w:p>
-      <w:pPr>
-        <w:spacing w:after="80" w:line="300"/>
-        <w:jc w:val="both"/>
-      </w:pPr>
-      <w:r>
-        <w:rPr>
-          <w:rFonts w:ascii="Times New Roman" w:cs="Times New Roman" w:eastAsia="Times New Roman" w:hAnsi="Times New Roman"/>
-          <w:b w:val="false"/>
-          <w:bCs w:val="false"/>
-          <w:i w:val="false"/>
-          <w:iCs w:val="false"/>
-          <w:sz w:val="24"/>
-          <w:szCs w:val="24"/>
-        </w:rPr>
-        <w:t xml:space="preserve">bè. Không ảnh hưởng các màn khác; đừng hoảng khi thấy agent báo lỗi.</w:t>
-      </w:r>
-    </w:p>
-    <w:p>
-      <w:pPr>
-        <w:spacing w:after="60"/>
-      </w:pPr>
-      <w:r>
-        <w:t xml:space="preserve"/>
-      </w:r>
-    </w:p>
-    <w:p>
-      <w:pPr>
-        <w:spacing w:after="80" w:line="300"/>
-        <w:jc w:val="both"/>
-      </w:pPr>
-      <w:r>
-        <w:rPr>
-          <w:rFonts w:ascii="Times New Roman" w:cs="Times New Roman" w:eastAsia="Times New Roman" w:hAnsi="Times New Roman"/>
-          <w:b w:val="false"/>
-          <w:bCs w:val="false"/>
-          <w:i w:val="false"/>
-          <w:iCs w:val="false"/>
-          <w:sz w:val="24"/>
-          <w:szCs w:val="24"/>
-        </w:rPr>
-        <w:t xml:space="preserve">Tập ít nhất </w:t>
-      </w:r>
-      <w:r>
-        <w:rPr>
-          <w:rFonts w:ascii="Times New Roman" w:cs="Times New Roman" w:eastAsia="Times New Roman" w:hAnsi="Times New Roman"/>
-          <w:b/>
-          <w:bCs/>
-          <w:i w:val="false"/>
-          <w:iCs w:val="false"/>
-          <w:sz w:val="24"/>
-          <w:szCs w:val="24"/>
-        </w:rPr>
-        <w:t xml:space="preserve">hai lượt trọn vẹn</w:t>
-      </w:r>
-      <w:r>
-        <w:rPr>
-          <w:rFonts w:ascii="Times New Roman" w:cs="Times New Roman" w:eastAsia="Times New Roman" w:hAnsi="Times New Roman"/>
-          <w:b w:val="false"/>
-          <w:bCs w:val="false"/>
-          <w:i w:val="false"/>
-          <w:iCs w:val="false"/>
-          <w:sz w:val="24"/>
-          <w:szCs w:val="24"/>
-        </w:rPr>
-        <w:t xml:space="preserve"> trước hôm lên lớp. Lượt đầu để nhớ thứ tự, lượt sau để nói cho trôi.</w:t>
+        <w:t xml:space="preserve">KICH_BAN_TAP_1MAY.pdf</w:t>
+      </w:r>
+      <w:r>
+        <w:rPr>
+          <w:rFonts w:ascii="Times New Roman" w:cs="Times New Roman" w:eastAsia="Times New Roman" w:hAnsi="Times New Roman"/>
+          <w:b w:val="false"/>
+          <w:bCs w:val="false"/>
+          <w:i/>
+          <w:iCs/>
+          <w:sz w:val="24"/>
+          <w:szCs w:val="24"/>
+        </w:rPr>
+        <w:t xml:space="preserve"> — bản dành riêng cho việc tự diễn thử trên một máy, chỉ chi tiết từng bước và ghi rõ con số phải thấy. Tập xong hai lượt rồi hãy quay lại file này.</w:t>
+      </w:r>
+    </w:p>
+    <w:p>
+      <w:pPr>
+        <w:spacing w:after="100"/>
+      </w:pPr>
+      <w:r>
+        <w:t xml:space="preserve"/>
       </w:r>
     </w:p>
     <w:p>

</xml_diff>